<commit_message>
feat(report): integración de plantilla oficial y corrección de nomenclatura
- Implementación de informes basados en Portada_informe.docx
- Restauración de nomenclatura estándar Informe_Marea_{nn}{aa}
- Refactorización de cabecera técnica con nombre de revisor real
- Actualización de marcadores a formato {Tag}
- Exclusión de archivos temporales de Word en csproj
</commit_message>
<xml_diff>
--- a/OBSArrastre2026.App/Resources/Templates/Portada_informe.docx
+++ b/OBSArrastre2026.App/Resources/Templates/Portada_informe.docx
@@ -715,9 +715,8 @@
                                 <w:sz w:val="44"/>
                                 <w:szCs w:val="32"/>
                               </w:rPr>
-                              <w:t xml:space="preserve">MAREA Nro </w:t>
+                              <w:t xml:space="preserve">MAREA </w:t>
                             </w:r>
-                            <w:bookmarkStart w:id="0" w:name="AñoMarea"/>
                             <w:r>
                               <w:rPr>
                                 <w:b/>
@@ -725,9 +724,8 @@
                                 <w:sz w:val="44"/>
                                 <w:szCs w:val="32"/>
                               </w:rPr>
-                              <w:t>Año(AAAA)</w:t>
+                              <w:t>{AñoMarea}</w:t>
                             </w:r>
-                            <w:bookmarkEnd w:id="0"/>
                             <w:r>
                               <w:rPr>
                                 <w:b/>
@@ -737,7 +735,6 @@
                               </w:rPr>
                               <w:t>/</w:t>
                             </w:r>
-                            <w:bookmarkStart w:id="1" w:name="NroMarea"/>
                             <w:r>
                               <w:rPr>
                                 <w:b/>
@@ -745,9 +742,8 @@
                                 <w:sz w:val="44"/>
                                 <w:szCs w:val="32"/>
                               </w:rPr>
-                              <w:t>Nro (aaa)</w:t>
+                              <w:t>{NroMarea}</w:t>
                             </w:r>
-                            <w:bookmarkEnd w:id="1"/>
                           </w:p>
                           <w:p>
                             <w:pPr>
@@ -792,7 +788,11 @@
           </mc:Choice>
           <mc:Fallback>
             <w:pict>
-              <v:shape w14:anchorId="30D55FAB" id="Cuadro de texto 193" o:spid="_x0000_s1028" type="#_x0000_t202" style="position:absolute;margin-left:-23.05pt;margin-top:24.45pt;width:541.8pt;height:35.55pt;z-index:251656704;visibility:visible;mso-wrap-style:square;mso-width-percent:0;mso-height-percent:0;mso-wrap-distance-left:9pt;mso-wrap-distance-top:0;mso-wrap-distance-right:9pt;mso-wrap-distance-bottom:0;mso-position-horizontal:absolute;mso-position-horizontal-relative:text;mso-position-vertical:absolute;mso-position-vertical-relative:text;mso-width-percent:0;mso-height-percent:0;mso-width-relative:page;mso-height-relative:page;v-text-anchor:top" o:gfxdata="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" filled="f" stroked="f">
+              <v:shapetype w14:anchorId="30D55FAB" id="_x0000_t202" coordsize="21600,21600" o:spt="202" path="m,l,21600r21600,l21600,xe">
+                <v:stroke joinstyle="miter"/>
+                <v:path gradientshapeok="t" o:connecttype="rect"/>
+              </v:shapetype>
+              <v:shape id="Cuadro de texto 193" o:spid="_x0000_s1028" type="#_x0000_t202" style="position:absolute;margin-left:-23.05pt;margin-top:24.45pt;width:541.8pt;height:35.55pt;z-index:251656704;visibility:visible;mso-wrap-style:square;mso-width-percent:0;mso-height-percent:0;mso-wrap-distance-left:9pt;mso-wrap-distance-top:0;mso-wrap-distance-right:9pt;mso-wrap-distance-bottom:0;mso-position-horizontal:absolute;mso-position-horizontal-relative:text;mso-position-vertical:absolute;mso-position-vertical-relative:text;mso-width-percent:0;mso-height-percent:0;mso-width-relative:page;mso-height-relative:page;v-text-anchor:top" o:gfxdata="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" filled="f" stroked="f">
                 <v:textbox>
                   <w:txbxContent>
                     <w:p>
@@ -811,9 +811,8 @@
                           <w:sz w:val="44"/>
                           <w:szCs w:val="32"/>
                         </w:rPr>
-                        <w:t xml:space="preserve">MAREA Nro </w:t>
+                        <w:t xml:space="preserve">MAREA </w:t>
                       </w:r>
-                      <w:bookmarkStart w:id="2" w:name="AñoMarea"/>
                       <w:r>
                         <w:rPr>
                           <w:b/>
@@ -821,9 +820,8 @@
                           <w:sz w:val="44"/>
                           <w:szCs w:val="32"/>
                         </w:rPr>
-                        <w:t>Año(AAAA)</w:t>
+                        <w:t>{AñoMarea}</w:t>
                       </w:r>
-                      <w:bookmarkEnd w:id="2"/>
                       <w:r>
                         <w:rPr>
                           <w:b/>
@@ -833,7 +831,6 @@
                         </w:rPr>
                         <w:t>/</w:t>
                       </w:r>
-                      <w:bookmarkStart w:id="3" w:name="NroMarea"/>
                       <w:r>
                         <w:rPr>
                           <w:b/>
@@ -841,9 +838,8 @@
                           <w:sz w:val="44"/>
                           <w:szCs w:val="32"/>
                         </w:rPr>
-                        <w:t>Nro (aaa)</w:t>
+                        <w:t>{NroMarea}</w:t>
                       </w:r>
-                      <w:bookmarkEnd w:id="3"/>
                     </w:p>
                     <w:p>
                       <w:pPr>
@@ -935,6 +931,15 @@
           <w:szCs w:val="32"/>
         </w:rPr>
       </w:pPr>
+      <w:r>
+        <w:rPr>
+          <w:b/>
+          <w:noProof/>
+          <w:sz w:val="36"/>
+          <w:szCs w:val="32"/>
+        </w:rPr>
+        <w:t>{PalabrasClave}</w:t>
+      </w:r>
     </w:p>
     <w:p>
       <w:pPr>
@@ -981,16 +986,24 @@
           <w:szCs w:val="32"/>
         </w:rPr>
       </w:pPr>
-      <w:bookmarkStart w:id="4" w:name="ApellidoNombreRevisor"/>
+      <w:bookmarkStart w:id="0" w:name="ApellidoNombreRevisor"/>
       <w:r>
         <w:rPr>
           <w:noProof/>
           <w:sz w:val="32"/>
           <w:szCs w:val="32"/>
         </w:rPr>
-        <w:t xml:space="preserve">Apellido Nombre </w:t>
+        <w:t>{ApellidoNombreRevisor}</w:t>
       </w:r>
-      <w:bookmarkEnd w:id="4"/>
+      <w:r>
+        <w:rPr>
+          <w:noProof/>
+          <w:sz w:val="32"/>
+          <w:szCs w:val="32"/>
+        </w:rPr>
+        <w:t xml:space="preserve"> </w:t>
+      </w:r>
+      <w:bookmarkEnd w:id="0"/>
     </w:p>
     <w:p>
       <w:pPr>
@@ -1142,16 +1155,7 @@
                                 <w:sz w:val="28"/>
                                 <w:szCs w:val="28"/>
                               </w:rPr>
-                              <w:t>Dirección de Información, Operación y Tecnología</w:t>
-                            </w:r>
-                            <w:r>
-                              <w:rPr>
-                                <w:bCs/>
-                                <w:noProof/>
-                                <w:sz w:val="28"/>
-                                <w:szCs w:val="28"/>
-                              </w:rPr>
-                              <w:t xml:space="preserve"> </w:t>
+                              <w:t xml:space="preserve">Dirección de Información, Operación y Tecnología </w:t>
                             </w:r>
                             <w:r>
                               <w:rPr>
@@ -1507,33 +1511,50 @@
       </w:rPr>
       <w:t xml:space="preserve">Marea </w:t>
     </w:r>
-    <w:bookmarkStart w:id="5" w:name="AñoMareaPie"/>
     <w:r>
       <w:rPr>
+        <w:bCs/>
         <w:sz w:val="18"/>
         <w:szCs w:val="16"/>
       </w:rPr>
-      <w:t>año</w:t>
+      <w:t>{</w:t>
     </w:r>
-    <w:bookmarkEnd w:id="5"/>
+    <w:proofErr w:type="spellStart"/>
     <w:r>
       <w:rPr>
+        <w:bCs/>
         <w:sz w:val="18"/>
         <w:szCs w:val="16"/>
       </w:rPr>
-      <w:t>/</w:t>
+      <w:t>AñoMarea</w:t>
     </w:r>
-    <w:bookmarkStart w:id="6" w:name="NroMareaPie"/>
+    <w:proofErr w:type="spellEnd"/>
+    <w:r>
+      <w:rPr>
+        <w:bCs/>
+        <w:sz w:val="18"/>
+        <w:szCs w:val="16"/>
+      </w:rPr>
+      <w:t>}/{</w:t>
+    </w:r>
     <w:proofErr w:type="spellStart"/>
     <w:r>
       <w:rPr>
+        <w:bCs/>
         <w:sz w:val="18"/>
         <w:szCs w:val="16"/>
       </w:rPr>
-      <w:t>nro</w:t>
+      <w:t>NroMarea</w:t>
     </w:r>
-    <w:bookmarkEnd w:id="6"/>
     <w:proofErr w:type="spellEnd"/>
+    <w:r>
+      <w:rPr>
+        <w:bCs/>
+        <w:sz w:val="18"/>
+        <w:szCs w:val="16"/>
+      </w:rPr>
+      <w:t>}</w:t>
+    </w:r>
     <w:r>
       <w:rPr>
         <w:sz w:val="18"/>

</xml_diff>

<commit_message>
feat(report): integración de metadatos extendidos y refinamiento del informe técnico
- Inclusión de Arte de Pesca en metadatos e importación
- Reemplazo dinámico de Palabras Clave (Tipo de buque + Pesquería)
- Nuevo diseño de secciones técnicas y marcadores de edición manual
- Actualización de etiquetas para Aleteo y Habitabilidad
</commit_message>
<xml_diff>
--- a/OBSArrastre2026.App/Resources/Templates/Portada_informe.docx
+++ b/OBSArrastre2026.App/Resources/Templates/Portada_informe.docx
@@ -1076,6 +1076,46 @@
           <w:lang w:eastAsia="en-US"/>
         </w:rPr>
       </w:pPr>
+    </w:p>
+    <w:p>
+      <w:pPr>
+        <w:ind w:right="-1134" w:firstLine="708"/>
+        <w:rPr>
+          <w:rFonts w:ascii="Encode Sans" w:hAnsi="Encode Sans"/>
+          <w:b/>
+          <w:noProof/>
+          <w:color w:val="FFFFFF"/>
+          <w:sz w:val="36"/>
+          <w:szCs w:val="32"/>
+          <w:lang w:eastAsia="en-US"/>
+        </w:rPr>
+      </w:pPr>
+    </w:p>
+    <w:p>
+      <w:pPr>
+        <w:ind w:right="-1134"/>
+        <w:rPr>
+          <w:rFonts w:ascii="Encode Sans" w:hAnsi="Encode Sans"/>
+          <w:b/>
+          <w:noProof/>
+          <w:color w:val="FFFFFF"/>
+          <w:sz w:val="36"/>
+          <w:szCs w:val="32"/>
+          <w:lang w:eastAsia="en-US"/>
+        </w:rPr>
+      </w:pPr>
+    </w:p>
+    <w:p>
+      <w:pPr>
+        <w:tabs>
+          <w:tab w:val="left" w:pos="426"/>
+        </w:tabs>
+        <w:jc w:val="center"/>
+        <w:rPr>
+          <w:i/>
+          <w:szCs w:val="22"/>
+        </w:rPr>
+      </w:pPr>
       <w:r>
         <w:rPr>
           <w:noProof/>
@@ -1084,13 +1124,13 @@
         <mc:AlternateContent>
           <mc:Choice Requires="wps">
             <w:drawing>
-              <wp:anchor distT="0" distB="0" distL="114300" distR="114300" simplePos="0" relativeHeight="251658752" behindDoc="0" locked="0" layoutInCell="1" allowOverlap="1" wp14:anchorId="6D5A5BB7" wp14:editId="27675609">
+              <wp:anchor distT="0" distB="0" distL="114300" distR="114300" simplePos="0" relativeHeight="251658752" behindDoc="0" locked="0" layoutInCell="1" allowOverlap="1" wp14:anchorId="6D5A5BB7" wp14:editId="03B8B2C0">
                 <wp:simplePos x="0" y="0"/>
-                <wp:positionH relativeFrom="column">
-                  <wp:posOffset>-374739</wp:posOffset>
+                <wp:positionH relativeFrom="margin">
+                  <wp:align>center</wp:align>
                 </wp:positionH>
                 <wp:positionV relativeFrom="paragraph">
-                  <wp:posOffset>224568</wp:posOffset>
+                  <wp:posOffset>474153</wp:posOffset>
                 </wp:positionV>
                 <wp:extent cx="6880860" cy="1339703"/>
                 <wp:effectExtent l="0" t="0" r="0" b="0"/>
@@ -1229,7 +1269,11 @@
           </mc:Choice>
           <mc:Fallback>
             <w:pict>
-              <v:shape w14:anchorId="6D5A5BB7" id="Cuadro de texto 1914920652" o:spid="_x0000_s1029" type="#_x0000_t202" style="position:absolute;margin-left:-29.5pt;margin-top:17.7pt;width:541.8pt;height:105.5pt;z-index:251658752;visibility:visible;mso-wrap-style:square;mso-width-percent:0;mso-height-percent:0;mso-wrap-distance-left:9pt;mso-wrap-distance-top:0;mso-wrap-distance-right:9pt;mso-wrap-distance-bottom:0;mso-position-horizontal:absolute;mso-position-horizontal-relative:text;mso-position-vertical:absolute;mso-position-vertical-relative:text;mso-width-percent:0;mso-height-percent:0;mso-width-relative:page;mso-height-relative:page;v-text-anchor:top" o:gfxdata="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" filled="f" stroked="f">
+              <v:shapetype w14:anchorId="6D5A5BB7" id="_x0000_t202" coordsize="21600,21600" o:spt="202" path="m,l,21600r21600,l21600,xe">
+                <v:stroke joinstyle="miter"/>
+                <v:path gradientshapeok="t" o:connecttype="rect"/>
+              </v:shapetype>
+              <v:shape id="Cuadro de texto 1914920652" o:spid="_x0000_s1029" type="#_x0000_t202" style="position:absolute;left:0;text-align:left;margin-left:0;margin-top:37.35pt;width:541.8pt;height:105.5pt;z-index:251658752;visibility:visible;mso-wrap-style:square;mso-width-percent:0;mso-height-percent:0;mso-wrap-distance-left:9pt;mso-wrap-distance-top:0;mso-wrap-distance-right:9pt;mso-wrap-distance-bottom:0;mso-position-horizontal:center;mso-position-horizontal-relative:margin;mso-position-vertical:absolute;mso-position-vertical-relative:text;mso-width-percent:0;mso-height-percent:0;mso-width-relative:page;mso-height-relative:page;v-text-anchor:top" o:gfxdata="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" filled="f" stroked="f">
                 <v:textbox>
                   <w:txbxContent>
                     <w:p>
@@ -1248,16 +1292,7 @@
                           <w:sz w:val="28"/>
                           <w:szCs w:val="28"/>
                         </w:rPr>
-                        <w:t>Dirección de Información, Operación y Tecnología</w:t>
-                      </w:r>
-                      <w:r>
-                        <w:rPr>
-                          <w:bCs/>
-                          <w:noProof/>
-                          <w:sz w:val="28"/>
-                          <w:szCs w:val="28"/>
-                        </w:rPr>
-                        <w:t xml:space="preserve"> </w:t>
+                        <w:t xml:space="preserve">Dirección de Información, Operación y Tecnología </w:t>
                       </w:r>
                       <w:r>
                         <w:rPr>
@@ -1314,51 +1349,12 @@
                     <w:p/>
                   </w:txbxContent>
                 </v:textbox>
+                <w10:wrap anchorx="margin"/>
               </v:shape>
             </w:pict>
           </mc:Fallback>
         </mc:AlternateContent>
       </w:r>
-    </w:p>
-    <w:p>
-      <w:pPr>
-        <w:ind w:right="-1134" w:firstLine="708"/>
-        <w:rPr>
-          <w:rFonts w:ascii="Encode Sans" w:hAnsi="Encode Sans"/>
-          <w:b/>
-          <w:noProof/>
-          <w:color w:val="FFFFFF"/>
-          <w:sz w:val="36"/>
-          <w:szCs w:val="32"/>
-          <w:lang w:eastAsia="en-US"/>
-        </w:rPr>
-      </w:pPr>
-    </w:p>
-    <w:p>
-      <w:pPr>
-        <w:ind w:right="-1134"/>
-        <w:rPr>
-          <w:rFonts w:ascii="Encode Sans" w:hAnsi="Encode Sans"/>
-          <w:b/>
-          <w:noProof/>
-          <w:color w:val="FFFFFF"/>
-          <w:sz w:val="36"/>
-          <w:szCs w:val="32"/>
-          <w:lang w:eastAsia="en-US"/>
-        </w:rPr>
-      </w:pPr>
-    </w:p>
-    <w:p>
-      <w:pPr>
-        <w:tabs>
-          <w:tab w:val="left" w:pos="426"/>
-        </w:tabs>
-        <w:jc w:val="center"/>
-        <w:rPr>
-          <w:i/>
-          <w:szCs w:val="22"/>
-        </w:rPr>
-      </w:pPr>
       <w:r>
         <w:rPr>
           <w:rFonts w:ascii="Encode Sans" w:hAnsi="Encode Sans"/>
@@ -4548,6 +4544,7 @@
   <w:style w:type="character" w:default="1" w:styleId="Fuentedeprrafopredeter">
     <w:name w:val="Default Paragraph Font"/>
     <w:uiPriority w:val="1"/>
+    <w:semiHidden/>
     <w:unhideWhenUsed/>
   </w:style>
   <w:style w:type="table" w:default="1" w:styleId="Tablanormal">

</xml_diff>